<commit_message>
labo2 Infomath + Projets certificatif 1 + 2 outilsMate
</commit_message>
<xml_diff>
--- a/Outils et Materiels/ProjetCertificatif_RAM.docx
+++ b/Outils et Materiels/ProjetCertificatif_RAM.docx
@@ -102,59 +102,56 @@
         <w:jc w:val="center"/>
       </w:pPr>
       <w:r>
-        <w:t>M. William Frederick Blewitt</w:t>
-      </w:r>
-    </w:p>
-    <w:p>
-      <w:pPr>
-        <w:jc w:val="center"/>
-      </w:pPr>
-    </w:p>
-    <w:p>
-      <w:pPr>
-        <w:jc w:val="center"/>
-      </w:pPr>
-    </w:p>
-    <w:p>
-      <w:pPr>
-        <w:jc w:val="center"/>
-      </w:pPr>
-    </w:p>
-    <w:p>
-      <w:pPr>
-        <w:jc w:val="center"/>
-      </w:pPr>
-    </w:p>
-    <w:p>
-      <w:pPr>
-        <w:jc w:val="center"/>
-      </w:pPr>
-    </w:p>
-    <w:p>
-      <w:pPr>
-        <w:jc w:val="center"/>
-      </w:pPr>
-    </w:p>
-    <w:p>
-      <w:pPr>
-        <w:jc w:val="center"/>
-      </w:pPr>
-      <w:r>
-        <w:t>Département de</w:t>
-      </w:r>
-      <w:r>
-        <w:t xml:space="preserve"> l’informatique</w:t>
-      </w:r>
-    </w:p>
-    <w:p>
-      <w:pPr>
-        <w:jc w:val="center"/>
-      </w:pPr>
-      <w:r>
-        <w:t>Cégep</w:t>
-      </w:r>
-      <w:r>
-        <w:t xml:space="preserve"> du Vieux-Montréal</w:t>
+        <w:t>Dr</w:t>
+      </w:r>
+      <w:r>
+        <w:t>. William Frederick Blewitt</w:t>
+      </w:r>
+    </w:p>
+    <w:p>
+      <w:pPr>
+        <w:jc w:val="center"/>
+      </w:pPr>
+    </w:p>
+    <w:p>
+      <w:pPr>
+        <w:jc w:val="center"/>
+      </w:pPr>
+    </w:p>
+    <w:p>
+      <w:pPr>
+        <w:jc w:val="center"/>
+      </w:pPr>
+    </w:p>
+    <w:p>
+      <w:pPr>
+        <w:jc w:val="center"/>
+      </w:pPr>
+    </w:p>
+    <w:p>
+      <w:pPr>
+        <w:jc w:val="center"/>
+      </w:pPr>
+    </w:p>
+    <w:p>
+      <w:pPr>
+        <w:jc w:val="center"/>
+      </w:pPr>
+    </w:p>
+    <w:p>
+      <w:pPr>
+        <w:jc w:val="center"/>
+      </w:pPr>
+      <w:r>
+        <w:t>Département de l’informatique</w:t>
+      </w:r>
+    </w:p>
+    <w:p>
+      <w:pPr>
+        <w:jc w:val="center"/>
+      </w:pPr>
+      <w:r>
+        <w:t>Cégep du Vieux-Montréal</w:t>
       </w:r>
     </w:p>
     <w:p>
@@ -169,163 +166,6 @@
       <w:pPr>
         <w:jc w:val="center"/>
       </w:pPr>
-    </w:p>
-    <w:p>
-      <w:pPr>
-        <w:pStyle w:val="Titre"/>
-      </w:pPr>
-      <w:r>
-        <w:lastRenderedPageBreak/>
-        <w:t>Recherche et ses critères</w:t>
-      </w:r>
-    </w:p>
-    <w:p>
-      <w:pPr>
-        <w:pStyle w:val="Paragraphedeliste"/>
-        <w:numPr>
-          <w:ilvl w:val="0"/>
-          <w:numId w:val="2"/>
-        </w:numPr>
-      </w:pPr>
-      <w:r>
-        <w:t>Distinguer DIMM et CAMM2 selon le dossier client</w:t>
-      </w:r>
-    </w:p>
-    <w:p>
-      <w:pPr>
-        <w:pStyle w:val="Paragraphedeliste"/>
-        <w:numPr>
-          <w:ilvl w:val="0"/>
-          <w:numId w:val="2"/>
-        </w:numPr>
-      </w:pPr>
-      <w:r>
-        <w:t>4 sources</w:t>
-      </w:r>
-    </w:p>
-    <w:p/>
-    <w:p>
-      <w:pPr>
-        <w:pStyle w:val="Titre1"/>
-      </w:pPr>
-      <w:r>
-        <w:t>Avantage DIMM</w:t>
-      </w:r>
-    </w:p>
-    <w:p>
-      <w:r>
-        <w:t>Plus rependu.</w:t>
-      </w:r>
-    </w:p>
-    <w:p>
-      <w:r>
-        <w:t xml:space="preserve">Plafonne </w:t>
-      </w:r>
-      <w:r>
-        <w:t xml:space="preserve">8 000MT/s </w:t>
-      </w:r>
-      <w:proofErr w:type="spellStart"/>
-      <w:r>
-        <w:t>barrete</w:t>
-      </w:r>
-      <w:proofErr w:type="spellEnd"/>
-      <w:r>
-        <w:t xml:space="preserve"> et SO DIMM 6300 MT/s</w:t>
-      </w:r>
-    </w:p>
-    <w:p>
-      <w:r>
-        <w:t>Entre 16 et 32 Go par module de capacité.</w:t>
-      </w:r>
-    </w:p>
-    <w:p>
-      <w:r>
-        <w:t>Plus accessible et répandu.</w:t>
-      </w:r>
-    </w:p>
-    <w:p>
-      <w:r>
-        <w:t>Plus d’emplacement sur une carte mère.</w:t>
-      </w:r>
-    </w:p>
-    <w:p>
-      <w:pPr>
-        <w:pStyle w:val="Titre1"/>
-      </w:pPr>
-      <w:r>
-        <w:t>Avantage CAMM2</w:t>
-      </w:r>
-    </w:p>
-    <w:p>
-      <w:r>
-        <w:t>Plus fine 57% moins haute qu’une SO-DIMM</w:t>
-      </w:r>
-    </w:p>
-    <w:p>
-      <w:r>
-        <w:t>Plus vite</w:t>
-      </w:r>
-    </w:p>
-    <w:p>
-      <w:r>
-        <w:t>BUS de données plus large par module (x128 vs x64 dans SO-DIMM</w:t>
-      </w:r>
-    </w:p>
-    <w:p>
-      <w:r>
-        <w:t>Entre 6 600 et 8000 MT/s</w:t>
-      </w:r>
-    </w:p>
-    <w:p>
-      <w:r>
-        <w:t xml:space="preserve">Jusqu`à 128 go par module </w:t>
-      </w:r>
-      <w:proofErr w:type="spellStart"/>
-      <w:r>
-        <w:t>aujourd’hu</w:t>
-      </w:r>
-      <w:proofErr w:type="spellEnd"/>
-    </w:p>
-    <w:p>
-      <w:r>
-        <w:t xml:space="preserve">Plus </w:t>
-      </w:r>
-      <w:proofErr w:type="spellStart"/>
-      <w:r>
-        <w:t>econome</w:t>
-      </w:r>
-      <w:proofErr w:type="spellEnd"/>
-      <w:r>
-        <w:t xml:space="preserve"> en énergie</w:t>
-      </w:r>
-    </w:p>
-    <w:p>
-      <w:r>
-        <w:t>Latence plus faible</w:t>
-      </w:r>
-    </w:p>
-    <w:p>
-      <w:r>
-        <w:t>Compatibilité restreinte avec Carte mère</w:t>
-      </w:r>
-    </w:p>
-    <w:p>
-      <w:r>
-        <w:t>1 emplacement sur carte mère pour l’instant.</w:t>
-      </w:r>
-    </w:p>
-    <w:p>
-      <w:pPr>
-        <w:rPr>
-          <w:rFonts w:asciiTheme="majorHAnsi" w:eastAsiaTheme="majorEastAsia" w:hAnsiTheme="majorHAnsi" w:cstheme="majorBidi"/>
-          <w:color w:val="0F4761" w:themeColor="accent1" w:themeShade="BF"/>
-          <w:sz w:val="40"/>
-          <w:szCs w:val="40"/>
-        </w:rPr>
-      </w:pPr>
-      <w:r>
-        <w:br w:type="page"/>
-      </w:r>
     </w:p>
     <w:p>
       <w:pPr>
@@ -546,10 +386,7 @@
         <w:jc w:val="both"/>
       </w:pPr>
       <w:r>
-        <w:t>Premièrement, CAMM2 est plus rapide. Il offre plus de méga transfères par second. Il y a moins de latences dû à sa position très proche avec la carte mère et à ses doubles canaux de Bus. Le point le plus intéressant pour le besoin du client Boréal est la consommation d’énergie.</w:t>
-      </w:r>
-      <w:r>
-        <w:t xml:space="preserve"> Les développeurs affich</w:t>
+        <w:t>Premièrement, CAMM2 est plus rapide. Il offre plus de méga transfères par second. Il y a moins de latences dû à sa position très proche avec la carte mère et à ses doubles canaux de Bus. Le point le plus intéressant pour le besoin du client Boréal est la consommation d’énergie. Les développeurs affich</w:t>
       </w:r>
       <w:r>
         <w:t>ent une efficacité d’énergie plus haute de 70% comparé au SO-DIMM. Il faudrait vérifier les installations de ventilations de l’entreprise Boréal, mais cet aspect est important dans le monde de l’IA où la gestion de la chaleur est critique autant pour l’infrastructure que pour l’environnement.</w:t>
@@ -599,7 +436,13 @@
         <w:jc w:val="both"/>
       </w:pPr>
       <w:r>
-        <w:t xml:space="preserve">En date de 2026, je recommande les barrette DIM pour l’utilisation de l’agent conversationnelle en domaine </w:t>
+        <w:t>En date de 2026, je recommande les barrette DIM</w:t>
+      </w:r>
+      <w:r>
+        <w:t>M</w:t>
+      </w:r>
+      <w:r>
+        <w:t xml:space="preserve"> pour l’utilisation de l’agent conversationnelle en domaine </w:t>
       </w:r>
       <w:r>
         <w:t xml:space="preserve">du service à la clientèle pour la compagnie Boréal. La principale raison est pour la disponibilité de l’évolutivité dans les 5 prochaines années, qui est un critère de la PME. En effet, on doit attendre ou faire confiance à l’entreprise avant de se procurer soit une carte mère avec 2 emplacements CAMM2, soit une barre de RAM CAMM2 128Go auprès du fabricant. Il est à noter que l’indisponibilité du produit dans le marché canadien actuellement pèse dans ma recommandation, cependant, l’instabilité de l’offre actuel est tout de même important. </w:t>
@@ -629,246 +472,286 @@
     <w:p>
       <w:pPr>
         <w:pStyle w:val="Titre1"/>
+        <w:jc w:val="center"/>
       </w:pPr>
       <w:r>
         <w:lastRenderedPageBreak/>
-        <w:t>SOURCES</w:t>
-      </w:r>
-    </w:p>
-    <w:p>
-      <w:r>
-        <w:t xml:space="preserve">[1] </w:t>
+        <w:t>Bibliographie</w:t>
+      </w:r>
+    </w:p>
+    <w:p>
+      <w:r>
+        <w:t xml:space="preserve">[1] « Avantages des modules de mémoire CAMM2 par rapport aux SO-DIMM », </w:t>
+      </w:r>
+      <w:proofErr w:type="spellStart"/>
+      <w:r>
+        <w:rPr>
+          <w:i/>
+          <w:iCs/>
+        </w:rPr>
+        <w:t>GuiaHardware</w:t>
+      </w:r>
+      <w:proofErr w:type="spellEnd"/>
+      <w:r>
+        <w:t xml:space="preserve">. [En ligne]. Disponible : </w:t>
       </w:r>
       <w:hyperlink r:id="rId5" w:history="1">
         <w:r>
           <w:rPr>
             <w:rStyle w:val="Lienhypertexte"/>
           </w:rPr>
-          <w:t>Avantages des modules de mémoire CAMM2 par rapport aux SO-DIMM</w:t>
+          <w:t>https://www.guiahardware.es/fr/camm2-avantages-r%C3%A9els-diff%C3%A9rences-avec-so-dimm-et-statut-de-la-norme/</w:t>
         </w:r>
       </w:hyperlink>
       <w:r>
-        <w:t>, comparaison CAMM</w:t>
-      </w:r>
-      <w:proofErr w:type="gramStart"/>
-      <w:r>
-        <w:t>2  et</w:t>
-      </w:r>
-      <w:proofErr w:type="gramEnd"/>
-      <w:r>
-        <w:t xml:space="preserve"> DIMM</w:t>
-      </w:r>
-    </w:p>
-    <w:p>
-      <w:r>
-        <w:t xml:space="preserve">[2] </w:t>
-      </w:r>
-      <w:hyperlink r:id="rId6" w:anchor=":~:text=How%20an%20AI%20agent%20manages%20its%20memory%20significantly,like%20these%20aim%20to%20optimize%20AI%20RAM%20usage." w:history="1">
+        <w:t xml:space="preserve">. [Consulté le : </w:t>
+      </w:r>
+      <w:r>
+        <w:t xml:space="preserve">28 </w:t>
+      </w:r>
+      <w:r>
+        <w:t>sept. 2026].</w:t>
+      </w:r>
+    </w:p>
+    <w:p>
+      <w:r>
+        <w:t xml:space="preserve">[2] « Why AI </w:t>
+      </w:r>
+      <w:proofErr w:type="spellStart"/>
+      <w:r>
+        <w:t>needs</w:t>
+      </w:r>
+      <w:proofErr w:type="spellEnd"/>
+      <w:r>
+        <w:t xml:space="preserve"> RAM: </w:t>
+      </w:r>
+      <w:proofErr w:type="spellStart"/>
+      <w:r>
+        <w:t>Understanding</w:t>
+      </w:r>
+      <w:proofErr w:type="spellEnd"/>
+      <w:r>
+        <w:t xml:space="preserve"> </w:t>
+      </w:r>
+      <w:proofErr w:type="spellStart"/>
+      <w:r>
+        <w:t>its</w:t>
+      </w:r>
+      <w:proofErr w:type="spellEnd"/>
+      <w:r>
+        <w:t xml:space="preserve"> </w:t>
+      </w:r>
+      <w:proofErr w:type="spellStart"/>
+      <w:r>
+        <w:t>role</w:t>
+      </w:r>
+      <w:proofErr w:type="spellEnd"/>
+      <w:r>
+        <w:t xml:space="preserve"> in agent memory », </w:t>
+      </w:r>
+      <w:r>
+        <w:rPr>
+          <w:i/>
+          <w:iCs/>
+        </w:rPr>
+        <w:t>AI Agent Memory</w:t>
+      </w:r>
+      <w:r>
+        <w:t xml:space="preserve">. [En ligne]. Disponible : </w:t>
+      </w:r>
+      <w:hyperlink r:id="rId6" w:history="1">
         <w:r>
           <w:rPr>
             <w:rStyle w:val="Lienhypertexte"/>
           </w:rPr>
-          <w:t xml:space="preserve">Why AI Needs RAM: </w:t>
-        </w:r>
-        <w:proofErr w:type="spellStart"/>
-        <w:r>
-          <w:rPr>
-            <w:rStyle w:val="Lienhypertexte"/>
-          </w:rPr>
-          <w:t>Understanding</w:t>
-        </w:r>
-        <w:proofErr w:type="spellEnd"/>
-        <w:r>
-          <w:rPr>
-            <w:rStyle w:val="Lienhypertexte"/>
-          </w:rPr>
-          <w:t xml:space="preserve"> </w:t>
-        </w:r>
-        <w:proofErr w:type="spellStart"/>
-        <w:r>
-          <w:rPr>
-            <w:rStyle w:val="Lienhypertexte"/>
-          </w:rPr>
-          <w:t>Its</w:t>
-        </w:r>
-        <w:proofErr w:type="spellEnd"/>
-        <w:r>
-          <w:rPr>
-            <w:rStyle w:val="Lienhypertexte"/>
-          </w:rPr>
-          <w:t xml:space="preserve"> </w:t>
-        </w:r>
-        <w:proofErr w:type="spellStart"/>
-        <w:r>
-          <w:rPr>
-            <w:rStyle w:val="Lienhypertexte"/>
-          </w:rPr>
-          <w:t>Role</w:t>
-        </w:r>
-        <w:proofErr w:type="spellEnd"/>
-        <w:r>
-          <w:rPr>
-            <w:rStyle w:val="Lienhypertexte"/>
-          </w:rPr>
-          <w:t xml:space="preserve"> in Agent Memory</w:t>
+          <w:t>https://aiagentmemory.org/articles/why-ai-ram/</w:t>
         </w:r>
       </w:hyperlink>
       <w:r>
+        <w:t xml:space="preserve">. [Consulté le : </w:t>
+      </w:r>
+      <w:r>
+        <w:t>28</w:t>
+      </w:r>
+      <w:r>
+        <w:t xml:space="preserve"> sept. 2026].</w:t>
+      </w:r>
+    </w:p>
+    <w:p>
+      <w:r>
+        <w:t xml:space="preserve">[3] « How </w:t>
+      </w:r>
+      <w:proofErr w:type="spellStart"/>
+      <w:r>
+        <w:t>much</w:t>
+      </w:r>
+      <w:proofErr w:type="spellEnd"/>
+      <w:r>
+        <w:t xml:space="preserve"> RAM and </w:t>
+      </w:r>
+      <w:proofErr w:type="spellStart"/>
+      <w:r>
+        <w:t>storage</w:t>
+      </w:r>
+      <w:proofErr w:type="spellEnd"/>
+      <w:r>
+        <w:t xml:space="preserve"> do </w:t>
+      </w:r>
+      <w:proofErr w:type="spellStart"/>
+      <w:r>
+        <w:t>you</w:t>
+      </w:r>
+      <w:proofErr w:type="spellEnd"/>
+      <w:r>
         <w:t xml:space="preserve"> </w:t>
       </w:r>
-    </w:p>
-    <w:p>
-      <w:r>
-        <w:t>Besoin de mémoire en IA</w:t>
-      </w:r>
-    </w:p>
-    <w:p>
-      <w:r>
-        <w:t xml:space="preserve">[3] </w:t>
+      <w:proofErr w:type="spellStart"/>
+      <w:r>
+        <w:t>need</w:t>
+      </w:r>
+      <w:proofErr w:type="spellEnd"/>
+      <w:r>
+        <w:t xml:space="preserve"> for local AI agents </w:t>
+      </w:r>
+      <w:proofErr w:type="spellStart"/>
+      <w:r>
+        <w:t>in</w:t>
+      </w:r>
+      <w:proofErr w:type="spellEnd"/>
+      <w:r>
+        <w:t xml:space="preserve"> 2026? », </w:t>
+      </w:r>
+      <w:proofErr w:type="spellStart"/>
+      <w:r>
+        <w:rPr>
+          <w:i/>
+          <w:iCs/>
+        </w:rPr>
+        <w:t>Aliteq</w:t>
+      </w:r>
+      <w:proofErr w:type="spellEnd"/>
+      <w:r>
+        <w:t xml:space="preserve">. [En ligne]. Disponible : </w:t>
       </w:r>
       <w:hyperlink r:id="rId7" w:history="1">
         <w:r>
           <w:rPr>
             <w:rStyle w:val="Lienhypertexte"/>
           </w:rPr>
-          <w:t xml:space="preserve">How Much RAM and Storage Do You Need for Local AI Agents </w:t>
+          <w:t>https://aliteq.com/how-much-ram-storage-local-ai-agents-2026</w:t>
         </w:r>
-        <w:proofErr w:type="spellStart"/>
-        <w:r>
-          <w:rPr>
-            <w:rStyle w:val="Lienhypertexte"/>
-          </w:rPr>
-          <w:t>in</w:t>
-        </w:r>
-        <w:proofErr w:type="spellEnd"/>
-        <w:r>
-          <w:rPr>
-            <w:rStyle w:val="Lienhypertexte"/>
-          </w:rPr>
-          <w:t xml:space="preserve"> 2026? · </w:t>
-        </w:r>
-        <w:proofErr w:type="spellStart"/>
-        <w:r>
-          <w:rPr>
-            <w:rStyle w:val="Lienhypertexte"/>
-          </w:rPr>
-          <w:t>Aliteq</w:t>
-        </w:r>
-        <w:proofErr w:type="spellEnd"/>
       </w:hyperlink>
-    </w:p>
-    <w:p>
-      <w:r>
-        <w:t xml:space="preserve">How </w:t>
-      </w:r>
-      <w:proofErr w:type="spellStart"/>
-      <w:r>
-        <w:t>much</w:t>
-      </w:r>
-      <w:proofErr w:type="spellEnd"/>
-      <w:r>
-        <w:t xml:space="preserve"> RAM per model.</w:t>
-      </w:r>
-    </w:p>
-    <w:p>
-      <w:r>
-        <w:t xml:space="preserve">[4] </w:t>
+      <w:r>
+        <w:t xml:space="preserve">. [Consulté le : </w:t>
+      </w:r>
+      <w:r>
+        <w:t>28</w:t>
+      </w:r>
+      <w:r>
+        <w:t xml:space="preserve"> sept. 2026].</w:t>
+      </w:r>
+    </w:p>
+    <w:p>
+      <w:r>
+        <w:t xml:space="preserve">[4] « Crucial 64GB LPCAMM2 LPDDR5X-7500 memory | CT64G75C2LP5X », </w:t>
+      </w:r>
+      <w:r>
+        <w:rPr>
+          <w:i/>
+          <w:iCs/>
+        </w:rPr>
+        <w:t>Crucial</w:t>
+      </w:r>
+      <w:r>
+        <w:t xml:space="preserve">. [En ligne]. Disponible : </w:t>
       </w:r>
       <w:hyperlink r:id="rId8" w:history="1">
         <w:r>
           <w:rPr>
             <w:rStyle w:val="Lienhypertexte"/>
           </w:rPr>
-          <w:t>Crucial 64GB LPCAMM2 LPDDR5X- 7500 memory | CT64G75C2LP5X | crucial.com</w:t>
+          <w:t>https://www.crucial.com/memory/ddr5/ct64g75c2lp5x</w:t>
         </w:r>
       </w:hyperlink>
       <w:r>
-        <w:t xml:space="preserve"> </w:t>
-      </w:r>
-    </w:p>
-    <w:p>
-      <w:r>
-        <w:t>Official page CAMM2</w:t>
-      </w:r>
-    </w:p>
-    <w:p>
-      <w:r>
-        <w:t xml:space="preserve">[5] </w:t>
-      </w:r>
-      <w:hyperlink r:id="rId9" w:anchor=":~:text=The%20developers%20claim%20that%20the%20new%20RAM%20form,CAMM2%20really%20has%20advantages%20in%20heat%20removal%20efficiency." w:history="1">
+        <w:t xml:space="preserve">. [Consulté le : </w:t>
+      </w:r>
+      <w:r>
+        <w:t>28</w:t>
+      </w:r>
+      <w:r>
+        <w:t xml:space="preserve"> sept. 2026].</w:t>
+      </w:r>
+    </w:p>
+    <w:p>
+      <w:r>
+        <w:t>[5</w:t>
+      </w:r>
+      <w:r>
+        <w:t>] «</w:t>
+      </w:r>
+      <w:r>
+        <w:t xml:space="preserve"> CAMM2: </w:t>
+      </w:r>
+      <w:proofErr w:type="spellStart"/>
+      <w:r>
+        <w:t>a</w:t>
+      </w:r>
+      <w:proofErr w:type="spellEnd"/>
+      <w:r>
+        <w:t xml:space="preserve"> new RAM standard », </w:t>
+      </w:r>
+      <w:r>
+        <w:rPr>
+          <w:i/>
+          <w:iCs/>
+        </w:rPr>
+        <w:t xml:space="preserve">Price </w:t>
+      </w:r>
+      <w:proofErr w:type="spellStart"/>
+      <w:r>
+        <w:rPr>
+          <w:i/>
+          <w:iCs/>
+        </w:rPr>
+        <w:t>comparison</w:t>
+      </w:r>
+      <w:proofErr w:type="spellEnd"/>
+      <w:r>
+        <w:rPr>
+          <w:i/>
+          <w:iCs/>
+        </w:rPr>
+        <w:t xml:space="preserve"> e-</w:t>
+      </w:r>
+      <w:proofErr w:type="spellStart"/>
+      <w:r>
+        <w:rPr>
+          <w:i/>
+          <w:iCs/>
+        </w:rPr>
+        <w:t>Catalog</w:t>
+      </w:r>
+      <w:proofErr w:type="spellEnd"/>
+      <w:r>
+        <w:t xml:space="preserve">. [En ligne]. Disponible : </w:t>
+      </w:r>
+      <w:hyperlink r:id="rId9" w:history="1">
         <w:r>
           <w:rPr>
             <w:rStyle w:val="Lienhypertexte"/>
           </w:rPr>
-          <w:t xml:space="preserve">CAMM2: </w:t>
+          <w:t>https://e-catalog.com/post/6324/188-what-is-camm2/</w:t>
         </w:r>
-        <w:proofErr w:type="spellStart"/>
-        <w:r>
-          <w:rPr>
-            <w:rStyle w:val="Lienhypertexte"/>
-          </w:rPr>
-          <w:t>a</w:t>
-        </w:r>
-        <w:proofErr w:type="spellEnd"/>
-        <w:r>
-          <w:rPr>
-            <w:rStyle w:val="Lienhypertexte"/>
-          </w:rPr>
-          <w:t xml:space="preserve"> new RAM standard | Price </w:t>
-        </w:r>
-        <w:proofErr w:type="spellStart"/>
-        <w:r>
-          <w:rPr>
-            <w:rStyle w:val="Lienhypertexte"/>
-          </w:rPr>
-          <w:t>comparison</w:t>
-        </w:r>
-        <w:proofErr w:type="spellEnd"/>
-        <w:r>
-          <w:rPr>
-            <w:rStyle w:val="Lienhypertexte"/>
-          </w:rPr>
-          <w:t xml:space="preserve"> e-</w:t>
-        </w:r>
-        <w:proofErr w:type="spellStart"/>
-        <w:r>
-          <w:rPr>
-            <w:rStyle w:val="Lienhypertexte"/>
-          </w:rPr>
-          <w:t>Catalog</w:t>
-        </w:r>
-        <w:proofErr w:type="spellEnd"/>
       </w:hyperlink>
-    </w:p>
-    <w:p>
-      <w:pPr>
-        <w:rPr>
-          <w:rFonts w:asciiTheme="majorHAnsi" w:eastAsiaTheme="majorEastAsia" w:hAnsiTheme="majorHAnsi" w:cstheme="majorBidi"/>
-          <w:color w:val="0F4761" w:themeColor="accent1" w:themeShade="BF"/>
-          <w:sz w:val="40"/>
-          <w:szCs w:val="40"/>
-        </w:rPr>
-      </w:pPr>
-      <w:r>
-        <w:t>Cons</w:t>
-      </w:r>
-      <w:r>
-        <w:t>ommations</w:t>
-      </w:r>
-      <w:r>
-        <w:t xml:space="preserve"> d’énergie et prix.</w:t>
-      </w:r>
-      <w:r>
-        <w:br w:type="page"/>
-      </w:r>
-    </w:p>
-    <w:p>
-      <w:pPr>
-        <w:pStyle w:val="Titre1"/>
-      </w:pPr>
-      <w:r>
-        <w:lastRenderedPageBreak/>
-        <w:t>Bibliographie</w:t>
+      <w:r>
+        <w:t xml:space="preserve">. [Consulté le : </w:t>
+      </w:r>
+      <w:r>
+        <w:t>28</w:t>
+      </w:r>
+      <w:r>
+        <w:t xml:space="preserve"> sept. 2026].</w:t>
       </w:r>
     </w:p>
     <w:p/>

</xml_diff>